<commit_message>
fix(report): update docx generator to use correct report images path
- Fixed DIAGRAM_MAP path from exports/hr/ to docs/tabs/exports/report/
- Regenerated report.docx with correct UC overview image
- 3 images now embedded in report.docx
</commit_message>
<xml_diff>
--- a/output/report.docx
+++ b/output/report.docx
@@ -7713,7 +7713,7 @@
       <w:r>
         <w:drawing>
           <wp:inline xmlns:a="http://schemas.openxmlformats.org/drawingml/2006/main" xmlns:pic="http://schemas.openxmlformats.org/drawingml/2006/picture">
-            <wp:extent cx="5029200" cy="2294489"/>
+            <wp:extent cx="5029200" cy="3201180"/>
             <wp:docPr id="5" name="Picture 5"/>
             <wp:cNvGraphicFramePr>
               <a:graphicFrameLocks noChangeAspect="1"/>
@@ -7722,7 +7722,7 @@
               <a:graphicData uri="http://schemas.openxmlformats.org/drawingml/2006/picture">
                 <pic:pic>
                   <pic:nvPicPr>
-                    <pic:cNvPr id="0" name="image_03.png"/>
+                    <pic:cNvPr id="0" name="image_01.png"/>
                     <pic:cNvPicPr/>
                   </pic:nvPicPr>
                   <pic:blipFill>
@@ -7734,7 +7734,7 @@
                   <pic:spPr>
                     <a:xfrm>
                       <a:off x="0" y="0"/>
-                      <a:ext cx="5029200" cy="2294489"/>
+                      <a:ext cx="5029200" cy="3201180"/>
                     </a:xfrm>
                     <a:prstGeom prst="rect"/>
                   </pic:spPr>

</xml_diff>

<commit_message>
fix(report): add entity, BCE, sequence diagrams to report docx
- Added PLACEHOLDERs for entity/BCE/sequence diagrams to phan-iii.md
- Updated DIAGRAM_MAP to map 15 new diagram keys
- Report.docx now has 18 images (from 5)
- Covers all 5 modules with UC + Entity + BCE + Sequence diagrams
</commit_message>
<xml_diff>
--- a/output/report.docx
+++ b/output/report.docx
@@ -4614,7 +4614,7 @@
       <w:r>
         <w:drawing>
           <wp:inline xmlns:a="http://schemas.openxmlformats.org/drawingml/2006/main" xmlns:pic="http://schemas.openxmlformats.org/drawingml/2006/picture">
-            <wp:extent cx="5029200" cy="6557682"/>
+            <wp:extent cx="5029200" cy="4956663"/>
             <wp:docPr id="1" name="Picture 1"/>
             <wp:cNvGraphicFramePr>
               <a:graphicFrameLocks noChangeAspect="1"/>
@@ -4635,7 +4635,113 @@
                   <pic:spPr>
                     <a:xfrm>
                       <a:off x="0" y="0"/>
-                      <a:ext cx="5029200" cy="6557682"/>
+                      <a:ext cx="5029200" cy="4956663"/>
+                    </a:xfrm>
+                    <a:prstGeom prst="rect"/>
+                  </pic:spPr>
+                </pic:pic>
+              </a:graphicData>
+            </a:graphic>
+          </wp:inline>
+        </w:drawing>
+      </w:r>
+    </w:p>
+    <w:p>
+      <w:pPr>
+        <w:pStyle w:val="Heading3"/>
+      </w:pPr>
+      <w:r>
+        <w:rPr>
+          <w:rFonts w:ascii="Times New Roman" w:hAnsi="Times New Roman"/>
+          <w:b/>
+          <w:color w:val="1F4E79"/>
+          <w:sz w:val="26"/>
+        </w:rPr>
+        <w:t>Biểu đồ Entity</w:t>
+      </w:r>
+    </w:p>
+    <w:p>
+      <w:pPr>
+        <w:jc w:val="center"/>
+      </w:pPr>
+      <w:r>
+        <w:drawing>
+          <wp:inline xmlns:a="http://schemas.openxmlformats.org/drawingml/2006/main" xmlns:pic="http://schemas.openxmlformats.org/drawingml/2006/picture">
+            <wp:extent cx="5029200" cy="4668308"/>
+            <wp:docPr id="2" name="Picture 2"/>
+            <wp:cNvGraphicFramePr>
+              <a:graphicFrameLocks noChangeAspect="1"/>
+            </wp:cNvGraphicFramePr>
+            <a:graphic>
+              <a:graphicData uri="http://schemas.openxmlformats.org/drawingml/2006/picture">
+                <pic:pic>
+                  <pic:nvPicPr>
+                    <pic:cNvPr id="0" name="image_07.png"/>
+                    <pic:cNvPicPr/>
+                  </pic:nvPicPr>
+                  <pic:blipFill>
+                    <a:blip r:embed="rId10"/>
+                    <a:stretch>
+                      <a:fillRect/>
+                    </a:stretch>
+                  </pic:blipFill>
+                  <pic:spPr>
+                    <a:xfrm>
+                      <a:off x="0" y="0"/>
+                      <a:ext cx="5029200" cy="4668308"/>
+                    </a:xfrm>
+                    <a:prstGeom prst="rect"/>
+                  </pic:spPr>
+                </pic:pic>
+              </a:graphicData>
+            </a:graphic>
+          </wp:inline>
+        </w:drawing>
+      </w:r>
+    </w:p>
+    <w:p>
+      <w:pPr>
+        <w:pStyle w:val="Heading3"/>
+      </w:pPr>
+      <w:r>
+        <w:rPr>
+          <w:rFonts w:ascii="Times New Roman" w:hAnsi="Times New Roman"/>
+          <w:b/>
+          <w:color w:val="1F4E79"/>
+          <w:sz w:val="26"/>
+        </w:rPr>
+        <w:t>Biểu đồ BCE phân tích</w:t>
+      </w:r>
+    </w:p>
+    <w:p>
+      <w:pPr>
+        <w:jc w:val="center"/>
+      </w:pPr>
+      <w:r>
+        <w:drawing>
+          <wp:inline xmlns:a="http://schemas.openxmlformats.org/drawingml/2006/main" xmlns:pic="http://schemas.openxmlformats.org/drawingml/2006/picture">
+            <wp:extent cx="5029200" cy="3169896"/>
+            <wp:docPr id="3" name="Picture 3"/>
+            <wp:cNvGraphicFramePr>
+              <a:graphicFrameLocks noChangeAspect="1"/>
+            </wp:cNvGraphicFramePr>
+            <a:graphic>
+              <a:graphicData uri="http://schemas.openxmlformats.org/drawingml/2006/picture">
+                <pic:pic>
+                  <pic:nvPicPr>
+                    <pic:cNvPr id="0" name="image_08.png"/>
+                    <pic:cNvPicPr/>
+                  </pic:nvPicPr>
+                  <pic:blipFill>
+                    <a:blip r:embed="rId11"/>
+                    <a:stretch>
+                      <a:fillRect/>
+                    </a:stretch>
+                  </pic:blipFill>
+                  <pic:spPr>
+                    <a:xfrm>
+                      <a:off x="0" y="0"/>
+                      <a:ext cx="5029200" cy="3169896"/>
                     </a:xfrm>
                     <a:prstGeom prst="rect"/>
                   </pic:spPr>
@@ -5312,8 +5418,8 @@
       <w:r>
         <w:drawing>
           <wp:inline xmlns:a="http://schemas.openxmlformats.org/drawingml/2006/main" xmlns:pic="http://schemas.openxmlformats.org/drawingml/2006/picture">
-            <wp:extent cx="5029200" cy="6557682"/>
-            <wp:docPr id="2" name="Picture 2"/>
+            <wp:extent cx="5029200" cy="2950312"/>
+            <wp:docPr id="4" name="Picture 4"/>
             <wp:cNvGraphicFramePr>
               <a:graphicFrameLocks noChangeAspect="1"/>
             </wp:cNvGraphicFramePr>
@@ -5325,7 +5431,7 @@
                     <pic:cNvPicPr/>
                   </pic:nvPicPr>
                   <pic:blipFill>
-                    <a:blip r:embed="rId10"/>
+                    <a:blip r:embed="rId12"/>
                     <a:stretch>
                       <a:fillRect/>
                     </a:stretch>
@@ -5333,7 +5439,166 @@
                   <pic:spPr>
                     <a:xfrm>
                       <a:off x="0" y="0"/>
-                      <a:ext cx="5029200" cy="6557682"/>
+                      <a:ext cx="5029200" cy="2950312"/>
+                    </a:xfrm>
+                    <a:prstGeom prst="rect"/>
+                  </pic:spPr>
+                </pic:pic>
+              </a:graphicData>
+            </a:graphic>
+          </wp:inline>
+        </w:drawing>
+      </w:r>
+    </w:p>
+    <w:p>
+      <w:pPr>
+        <w:pStyle w:val="Heading3"/>
+      </w:pPr>
+      <w:r>
+        <w:rPr>
+          <w:rFonts w:ascii="Times New Roman" w:hAnsi="Times New Roman"/>
+          <w:b/>
+          <w:color w:val="1F4E79"/>
+          <w:sz w:val="26"/>
+        </w:rPr>
+        <w:t>Biểu đồ Entity</w:t>
+      </w:r>
+    </w:p>
+    <w:p>
+      <w:pPr>
+        <w:jc w:val="center"/>
+      </w:pPr>
+      <w:r>
+        <w:drawing>
+          <wp:inline xmlns:a="http://schemas.openxmlformats.org/drawingml/2006/main" xmlns:pic="http://schemas.openxmlformats.org/drawingml/2006/picture">
+            <wp:extent cx="5029200" cy="4490838"/>
+            <wp:docPr id="5" name="Picture 5"/>
+            <wp:cNvGraphicFramePr>
+              <a:graphicFrameLocks noChangeAspect="1"/>
+            </wp:cNvGraphicFramePr>
+            <a:graphic>
+              <a:graphicData uri="http://schemas.openxmlformats.org/drawingml/2006/picture">
+                <pic:pic>
+                  <pic:nvPicPr>
+                    <pic:cNvPr id="0" name="image_06.png"/>
+                    <pic:cNvPicPr/>
+                  </pic:nvPicPr>
+                  <pic:blipFill>
+                    <a:blip r:embed="rId13"/>
+                    <a:stretch>
+                      <a:fillRect/>
+                    </a:stretch>
+                  </pic:blipFill>
+                  <pic:spPr>
+                    <a:xfrm>
+                      <a:off x="0" y="0"/>
+                      <a:ext cx="5029200" cy="4490838"/>
+                    </a:xfrm>
+                    <a:prstGeom prst="rect"/>
+                  </pic:spPr>
+                </pic:pic>
+              </a:graphicData>
+            </a:graphic>
+          </wp:inline>
+        </w:drawing>
+      </w:r>
+    </w:p>
+    <w:p>
+      <w:pPr>
+        <w:pStyle w:val="Heading3"/>
+      </w:pPr>
+      <w:r>
+        <w:rPr>
+          <w:rFonts w:ascii="Times New Roman" w:hAnsi="Times New Roman"/>
+          <w:b/>
+          <w:color w:val="1F4E79"/>
+          <w:sz w:val="26"/>
+        </w:rPr>
+        <w:t>Biểu đồ BCE phân tích</w:t>
+      </w:r>
+    </w:p>
+    <w:p>
+      <w:pPr>
+        <w:jc w:val="center"/>
+      </w:pPr>
+      <w:r>
+        <w:drawing>
+          <wp:inline xmlns:a="http://schemas.openxmlformats.org/drawingml/2006/main" xmlns:pic="http://schemas.openxmlformats.org/drawingml/2006/picture">
+            <wp:extent cx="5029200" cy="2750173"/>
+            <wp:docPr id="6" name="Picture 6"/>
+            <wp:cNvGraphicFramePr>
+              <a:graphicFrameLocks noChangeAspect="1"/>
+            </wp:cNvGraphicFramePr>
+            <a:graphic>
+              <a:graphicData uri="http://schemas.openxmlformats.org/drawingml/2006/picture">
+                <pic:pic>
+                  <pic:nvPicPr>
+                    <pic:cNvPr id="0" name="image_07.png"/>
+                    <pic:cNvPicPr/>
+                  </pic:nvPicPr>
+                  <pic:blipFill>
+                    <a:blip r:embed="rId14"/>
+                    <a:stretch>
+                      <a:fillRect/>
+                    </a:stretch>
+                  </pic:blipFill>
+                  <pic:spPr>
+                    <a:xfrm>
+                      <a:off x="0" y="0"/>
+                      <a:ext cx="5029200" cy="2750173"/>
+                    </a:xfrm>
+                    <a:prstGeom prst="rect"/>
+                  </pic:spPr>
+                </pic:pic>
+              </a:graphicData>
+            </a:graphic>
+          </wp:inline>
+        </w:drawing>
+      </w:r>
+    </w:p>
+    <w:p>
+      <w:pPr>
+        <w:pStyle w:val="Heading3"/>
+      </w:pPr>
+      <w:r>
+        <w:rPr>
+          <w:rFonts w:ascii="Times New Roman" w:hAnsi="Times New Roman"/>
+          <w:b/>
+          <w:color w:val="1F4E79"/>
+          <w:sz w:val="26"/>
+        </w:rPr>
+        <w:t>Biểu đồ tuần tự</w:t>
+      </w:r>
+    </w:p>
+    <w:p>
+      <w:pPr>
+        <w:jc w:val="center"/>
+      </w:pPr>
+      <w:r>
+        <w:drawing>
+          <wp:inline xmlns:a="http://schemas.openxmlformats.org/drawingml/2006/main" xmlns:pic="http://schemas.openxmlformats.org/drawingml/2006/picture">
+            <wp:extent cx="5029200" cy="5799631"/>
+            <wp:docPr id="7" name="Picture 7"/>
+            <wp:cNvGraphicFramePr>
+              <a:graphicFrameLocks noChangeAspect="1"/>
+            </wp:cNvGraphicFramePr>
+            <a:graphic>
+              <a:graphicData uri="http://schemas.openxmlformats.org/drawingml/2006/picture">
+                <pic:pic>
+                  <pic:nvPicPr>
+                    <pic:cNvPr id="0" name="image_11.png"/>
+                    <pic:cNvPicPr/>
+                  </pic:nvPicPr>
+                  <pic:blipFill>
+                    <a:blip r:embed="rId15"/>
+                    <a:stretch>
+                      <a:fillRect/>
+                    </a:stretch>
+                  </pic:blipFill>
+                  <pic:spPr>
+                    <a:xfrm>
+                      <a:off x="0" y="0"/>
+                      <a:ext cx="5029200" cy="5799631"/>
                     </a:xfrm>
                     <a:prstGeom prst="rect"/>
                   </pic:spPr>
@@ -6026,8 +6291,8 @@
       <w:r>
         <w:drawing>
           <wp:inline xmlns:a="http://schemas.openxmlformats.org/drawingml/2006/main" xmlns:pic="http://schemas.openxmlformats.org/drawingml/2006/picture">
-            <wp:extent cx="5029200" cy="6557682"/>
-            <wp:docPr id="3" name="Picture 3"/>
+            <wp:extent cx="5029200" cy="3414363"/>
+            <wp:docPr id="8" name="Picture 8"/>
             <wp:cNvGraphicFramePr>
               <a:graphicFrameLocks noChangeAspect="1"/>
             </wp:cNvGraphicFramePr>
@@ -6039,7 +6304,7 @@
                     <pic:cNvPicPr/>
                   </pic:nvPicPr>
                   <pic:blipFill>
-                    <a:blip r:embed="rId9"/>
+                    <a:blip r:embed="rId16"/>
                     <a:stretch>
                       <a:fillRect/>
                     </a:stretch>
@@ -6047,7 +6312,166 @@
                   <pic:spPr>
                     <a:xfrm>
                       <a:off x="0" y="0"/>
-                      <a:ext cx="5029200" cy="6557682"/>
+                      <a:ext cx="5029200" cy="3414363"/>
+                    </a:xfrm>
+                    <a:prstGeom prst="rect"/>
+                  </pic:spPr>
+                </pic:pic>
+              </a:graphicData>
+            </a:graphic>
+          </wp:inline>
+        </w:drawing>
+      </w:r>
+    </w:p>
+    <w:p>
+      <w:pPr>
+        <w:pStyle w:val="Heading3"/>
+      </w:pPr>
+      <w:r>
+        <w:rPr>
+          <w:rFonts w:ascii="Times New Roman" w:hAnsi="Times New Roman"/>
+          <w:b/>
+          <w:color w:val="1F4E79"/>
+          <w:sz w:val="26"/>
+        </w:rPr>
+        <w:t>Biểu đồ Entity</w:t>
+      </w:r>
+    </w:p>
+    <w:p>
+      <w:pPr>
+        <w:jc w:val="center"/>
+      </w:pPr>
+      <w:r>
+        <w:drawing>
+          <wp:inline xmlns:a="http://schemas.openxmlformats.org/drawingml/2006/main" xmlns:pic="http://schemas.openxmlformats.org/drawingml/2006/picture">
+            <wp:extent cx="5029200" cy="2683437"/>
+            <wp:docPr id="9" name="Picture 9"/>
+            <wp:cNvGraphicFramePr>
+              <a:graphicFrameLocks noChangeAspect="1"/>
+            </wp:cNvGraphicFramePr>
+            <a:graphic>
+              <a:graphicData uri="http://schemas.openxmlformats.org/drawingml/2006/picture">
+                <pic:pic>
+                  <pic:nvPicPr>
+                    <pic:cNvPr id="0" name="image_06.png"/>
+                    <pic:cNvPicPr/>
+                  </pic:nvPicPr>
+                  <pic:blipFill>
+                    <a:blip r:embed="rId17"/>
+                    <a:stretch>
+                      <a:fillRect/>
+                    </a:stretch>
+                  </pic:blipFill>
+                  <pic:spPr>
+                    <a:xfrm>
+                      <a:off x="0" y="0"/>
+                      <a:ext cx="5029200" cy="2683437"/>
+                    </a:xfrm>
+                    <a:prstGeom prst="rect"/>
+                  </pic:spPr>
+                </pic:pic>
+              </a:graphicData>
+            </a:graphic>
+          </wp:inline>
+        </w:drawing>
+      </w:r>
+    </w:p>
+    <w:p>
+      <w:pPr>
+        <w:pStyle w:val="Heading3"/>
+      </w:pPr>
+      <w:r>
+        <w:rPr>
+          <w:rFonts w:ascii="Times New Roman" w:hAnsi="Times New Roman"/>
+          <w:b/>
+          <w:color w:val="1F4E79"/>
+          <w:sz w:val="26"/>
+        </w:rPr>
+        <w:t>Biểu đồ BCE phân tích</w:t>
+      </w:r>
+    </w:p>
+    <w:p>
+      <w:pPr>
+        <w:jc w:val="center"/>
+      </w:pPr>
+      <w:r>
+        <w:drawing>
+          <wp:inline xmlns:a="http://schemas.openxmlformats.org/drawingml/2006/main" xmlns:pic="http://schemas.openxmlformats.org/drawingml/2006/picture">
+            <wp:extent cx="5029200" cy="2123245"/>
+            <wp:docPr id="10" name="Picture 10"/>
+            <wp:cNvGraphicFramePr>
+              <a:graphicFrameLocks noChangeAspect="1"/>
+            </wp:cNvGraphicFramePr>
+            <a:graphic>
+              <a:graphicData uri="http://schemas.openxmlformats.org/drawingml/2006/picture">
+                <pic:pic>
+                  <pic:nvPicPr>
+                    <pic:cNvPr id="0" name="image_07.png"/>
+                    <pic:cNvPicPr/>
+                  </pic:nvPicPr>
+                  <pic:blipFill>
+                    <a:blip r:embed="rId18"/>
+                    <a:stretch>
+                      <a:fillRect/>
+                    </a:stretch>
+                  </pic:blipFill>
+                  <pic:spPr>
+                    <a:xfrm>
+                      <a:off x="0" y="0"/>
+                      <a:ext cx="5029200" cy="2123245"/>
+                    </a:xfrm>
+                    <a:prstGeom prst="rect"/>
+                  </pic:spPr>
+                </pic:pic>
+              </a:graphicData>
+            </a:graphic>
+          </wp:inline>
+        </w:drawing>
+      </w:r>
+    </w:p>
+    <w:p>
+      <w:pPr>
+        <w:pStyle w:val="Heading3"/>
+      </w:pPr>
+      <w:r>
+        <w:rPr>
+          <w:rFonts w:ascii="Times New Roman" w:hAnsi="Times New Roman"/>
+          <w:b/>
+          <w:color w:val="1F4E79"/>
+          <w:sz w:val="26"/>
+        </w:rPr>
+        <w:t>Biểu đồ tuần tự</w:t>
+      </w:r>
+    </w:p>
+    <w:p>
+      <w:pPr>
+        <w:jc w:val="center"/>
+      </w:pPr>
+      <w:r>
+        <w:drawing>
+          <wp:inline xmlns:a="http://schemas.openxmlformats.org/drawingml/2006/main" xmlns:pic="http://schemas.openxmlformats.org/drawingml/2006/picture">
+            <wp:extent cx="5029200" cy="2955732"/>
+            <wp:docPr id="11" name="Picture 11"/>
+            <wp:cNvGraphicFramePr>
+              <a:graphicFrameLocks noChangeAspect="1"/>
+            </wp:cNvGraphicFramePr>
+            <a:graphic>
+              <a:graphicData uri="http://schemas.openxmlformats.org/drawingml/2006/picture">
+                <pic:pic>
+                  <pic:nvPicPr>
+                    <pic:cNvPr id="0" name="image_11.png"/>
+                    <pic:cNvPicPr/>
+                  </pic:nvPicPr>
+                  <pic:blipFill>
+                    <a:blip r:embed="rId19"/>
+                    <a:stretch>
+                      <a:fillRect/>
+                    </a:stretch>
+                  </pic:blipFill>
+                  <pic:spPr>
+                    <a:xfrm>
+                      <a:off x="0" y="0"/>
+                      <a:ext cx="5029200" cy="2955732"/>
                     </a:xfrm>
                     <a:prstGeom prst="rect"/>
                   </pic:spPr>
@@ -6979,8 +7403,8 @@
       <w:r>
         <w:drawing>
           <wp:inline xmlns:a="http://schemas.openxmlformats.org/drawingml/2006/main" xmlns:pic="http://schemas.openxmlformats.org/drawingml/2006/picture">
-            <wp:extent cx="5029200" cy="6557682"/>
-            <wp:docPr id="4" name="Picture 4"/>
+            <wp:extent cx="5029200" cy="2799761"/>
+            <wp:docPr id="12" name="Picture 12"/>
             <wp:cNvGraphicFramePr>
               <a:graphicFrameLocks noChangeAspect="1"/>
             </wp:cNvGraphicFramePr>
@@ -6992,7 +7416,7 @@
                     <pic:cNvPicPr/>
                   </pic:nvPicPr>
                   <pic:blipFill>
-                    <a:blip r:embed="rId9"/>
+                    <a:blip r:embed="rId20"/>
                     <a:stretch>
                       <a:fillRect/>
                     </a:stretch>
@@ -7000,7 +7424,113 @@
                   <pic:spPr>
                     <a:xfrm>
                       <a:off x="0" y="0"/>
-                      <a:ext cx="5029200" cy="6557682"/>
+                      <a:ext cx="5029200" cy="2799761"/>
+                    </a:xfrm>
+                    <a:prstGeom prst="rect"/>
+                  </pic:spPr>
+                </pic:pic>
+              </a:graphicData>
+            </a:graphic>
+          </wp:inline>
+        </w:drawing>
+      </w:r>
+    </w:p>
+    <w:p>
+      <w:pPr>
+        <w:pStyle w:val="Heading3"/>
+      </w:pPr>
+      <w:r>
+        <w:rPr>
+          <w:rFonts w:ascii="Times New Roman" w:hAnsi="Times New Roman"/>
+          <w:b/>
+          <w:color w:val="1F4E79"/>
+          <w:sz w:val="26"/>
+        </w:rPr>
+        <w:t>Biểu đồ Entity</w:t>
+      </w:r>
+    </w:p>
+    <w:p>
+      <w:pPr>
+        <w:jc w:val="center"/>
+      </w:pPr>
+      <w:r>
+        <w:drawing>
+          <wp:inline xmlns:a="http://schemas.openxmlformats.org/drawingml/2006/main" xmlns:pic="http://schemas.openxmlformats.org/drawingml/2006/picture">
+            <wp:extent cx="5029200" cy="7782412"/>
+            <wp:docPr id="13" name="Picture 13"/>
+            <wp:cNvGraphicFramePr>
+              <a:graphicFrameLocks noChangeAspect="1"/>
+            </wp:cNvGraphicFramePr>
+            <a:graphic>
+              <a:graphicData uri="http://schemas.openxmlformats.org/drawingml/2006/picture">
+                <pic:pic>
+                  <pic:nvPicPr>
+                    <pic:cNvPr id="0" name="image_06.png"/>
+                    <pic:cNvPicPr/>
+                  </pic:nvPicPr>
+                  <pic:blipFill>
+                    <a:blip r:embed="rId21"/>
+                    <a:stretch>
+                      <a:fillRect/>
+                    </a:stretch>
+                  </pic:blipFill>
+                  <pic:spPr>
+                    <a:xfrm>
+                      <a:off x="0" y="0"/>
+                      <a:ext cx="5029200" cy="7782412"/>
+                    </a:xfrm>
+                    <a:prstGeom prst="rect"/>
+                  </pic:spPr>
+                </pic:pic>
+              </a:graphicData>
+            </a:graphic>
+          </wp:inline>
+        </w:drawing>
+      </w:r>
+    </w:p>
+    <w:p>
+      <w:pPr>
+        <w:pStyle w:val="Heading3"/>
+      </w:pPr>
+      <w:r>
+        <w:rPr>
+          <w:rFonts w:ascii="Times New Roman" w:hAnsi="Times New Roman"/>
+          <w:b/>
+          <w:color w:val="1F4E79"/>
+          <w:sz w:val="26"/>
+        </w:rPr>
+        <w:t>Biểu đồ BCE phân tích</w:t>
+      </w:r>
+    </w:p>
+    <w:p>
+      <w:pPr>
+        <w:jc w:val="center"/>
+      </w:pPr>
+      <w:r>
+        <w:drawing>
+          <wp:inline xmlns:a="http://schemas.openxmlformats.org/drawingml/2006/main" xmlns:pic="http://schemas.openxmlformats.org/drawingml/2006/picture">
+            <wp:extent cx="5029200" cy="2731792"/>
+            <wp:docPr id="14" name="Picture 14"/>
+            <wp:cNvGraphicFramePr>
+              <a:graphicFrameLocks noChangeAspect="1"/>
+            </wp:cNvGraphicFramePr>
+            <a:graphic>
+              <a:graphicData uri="http://schemas.openxmlformats.org/drawingml/2006/picture">
+                <pic:pic>
+                  <pic:nvPicPr>
+                    <pic:cNvPr id="0" name="image_07.png"/>
+                    <pic:cNvPicPr/>
+                  </pic:nvPicPr>
+                  <pic:blipFill>
+                    <a:blip r:embed="rId22"/>
+                    <a:stretch>
+                      <a:fillRect/>
+                    </a:stretch>
+                  </pic:blipFill>
+                  <pic:spPr>
+                    <a:xfrm>
+                      <a:off x="0" y="0"/>
+                      <a:ext cx="5029200" cy="2731792"/>
                     </a:xfrm>
                     <a:prstGeom prst="rect"/>
                   </pic:spPr>
@@ -7714,7 +8244,7 @@
         <w:drawing>
           <wp:inline xmlns:a="http://schemas.openxmlformats.org/drawingml/2006/main" xmlns:pic="http://schemas.openxmlformats.org/drawingml/2006/picture">
             <wp:extent cx="5029200" cy="3201180"/>
-            <wp:docPr id="5" name="Picture 5"/>
+            <wp:docPr id="15" name="Picture 15"/>
             <wp:cNvGraphicFramePr>
               <a:graphicFrameLocks noChangeAspect="1"/>
             </wp:cNvGraphicFramePr>
@@ -7726,7 +8256,7 @@
                     <pic:cNvPicPr/>
                   </pic:nvPicPr>
                   <pic:blipFill>
-                    <a:blip r:embed="rId11"/>
+                    <a:blip r:embed="rId23"/>
                     <a:stretch>
                       <a:fillRect/>
                     </a:stretch>
@@ -7735,6 +8265,165 @@
                     <a:xfrm>
                       <a:off x="0" y="0"/>
                       <a:ext cx="5029200" cy="3201180"/>
+                    </a:xfrm>
+                    <a:prstGeom prst="rect"/>
+                  </pic:spPr>
+                </pic:pic>
+              </a:graphicData>
+            </a:graphic>
+          </wp:inline>
+        </w:drawing>
+      </w:r>
+    </w:p>
+    <w:p>
+      <w:pPr>
+        <w:pStyle w:val="Heading3"/>
+      </w:pPr>
+      <w:r>
+        <w:rPr>
+          <w:rFonts w:ascii="Times New Roman" w:hAnsi="Times New Roman"/>
+          <w:b/>
+          <w:color w:val="1F4E79"/>
+          <w:sz w:val="26"/>
+        </w:rPr>
+        <w:t>Biểu đồ Entity</w:t>
+      </w:r>
+    </w:p>
+    <w:p>
+      <w:pPr>
+        <w:jc w:val="center"/>
+      </w:pPr>
+      <w:r>
+        <w:drawing>
+          <wp:inline xmlns:a="http://schemas.openxmlformats.org/drawingml/2006/main" xmlns:pic="http://schemas.openxmlformats.org/drawingml/2006/picture">
+            <wp:extent cx="5029200" cy="4649638"/>
+            <wp:docPr id="16" name="Picture 16"/>
+            <wp:cNvGraphicFramePr>
+              <a:graphicFrameLocks noChangeAspect="1"/>
+            </wp:cNvGraphicFramePr>
+            <a:graphic>
+              <a:graphicData uri="http://schemas.openxmlformats.org/drawingml/2006/picture">
+                <pic:pic>
+                  <pic:nvPicPr>
+                    <pic:cNvPr id="0" name="image_06.png"/>
+                    <pic:cNvPicPr/>
+                  </pic:nvPicPr>
+                  <pic:blipFill>
+                    <a:blip r:embed="rId24"/>
+                    <a:stretch>
+                      <a:fillRect/>
+                    </a:stretch>
+                  </pic:blipFill>
+                  <pic:spPr>
+                    <a:xfrm>
+                      <a:off x="0" y="0"/>
+                      <a:ext cx="5029200" cy="4649638"/>
+                    </a:xfrm>
+                    <a:prstGeom prst="rect"/>
+                  </pic:spPr>
+                </pic:pic>
+              </a:graphicData>
+            </a:graphic>
+          </wp:inline>
+        </w:drawing>
+      </w:r>
+    </w:p>
+    <w:p>
+      <w:pPr>
+        <w:pStyle w:val="Heading3"/>
+      </w:pPr>
+      <w:r>
+        <w:rPr>
+          <w:rFonts w:ascii="Times New Roman" w:hAnsi="Times New Roman"/>
+          <w:b/>
+          <w:color w:val="1F4E79"/>
+          <w:sz w:val="26"/>
+        </w:rPr>
+        <w:t>Biểu đồ BCE phân tích</w:t>
+      </w:r>
+    </w:p>
+    <w:p>
+      <w:pPr>
+        <w:jc w:val="center"/>
+      </w:pPr>
+      <w:r>
+        <w:drawing>
+          <wp:inline xmlns:a="http://schemas.openxmlformats.org/drawingml/2006/main" xmlns:pic="http://schemas.openxmlformats.org/drawingml/2006/picture">
+            <wp:extent cx="5029200" cy="1400912"/>
+            <wp:docPr id="17" name="Picture 17"/>
+            <wp:cNvGraphicFramePr>
+              <a:graphicFrameLocks noChangeAspect="1"/>
+            </wp:cNvGraphicFramePr>
+            <a:graphic>
+              <a:graphicData uri="http://schemas.openxmlformats.org/drawingml/2006/picture">
+                <pic:pic>
+                  <pic:nvPicPr>
+                    <pic:cNvPr id="0" name="image_07.png"/>
+                    <pic:cNvPicPr/>
+                  </pic:nvPicPr>
+                  <pic:blipFill>
+                    <a:blip r:embed="rId25"/>
+                    <a:stretch>
+                      <a:fillRect/>
+                    </a:stretch>
+                  </pic:blipFill>
+                  <pic:spPr>
+                    <a:xfrm>
+                      <a:off x="0" y="0"/>
+                      <a:ext cx="5029200" cy="1400912"/>
+                    </a:xfrm>
+                    <a:prstGeom prst="rect"/>
+                  </pic:spPr>
+                </pic:pic>
+              </a:graphicData>
+            </a:graphic>
+          </wp:inline>
+        </w:drawing>
+      </w:r>
+    </w:p>
+    <w:p>
+      <w:pPr>
+        <w:pStyle w:val="Heading3"/>
+      </w:pPr>
+      <w:r>
+        <w:rPr>
+          <w:rFonts w:ascii="Times New Roman" w:hAnsi="Times New Roman"/>
+          <w:b/>
+          <w:color w:val="1F4E79"/>
+          <w:sz w:val="26"/>
+        </w:rPr>
+        <w:t>Biểu đồ tuần tự</w:t>
+      </w:r>
+    </w:p>
+    <w:p>
+      <w:pPr>
+        <w:jc w:val="center"/>
+      </w:pPr>
+      <w:r>
+        <w:drawing>
+          <wp:inline xmlns:a="http://schemas.openxmlformats.org/drawingml/2006/main" xmlns:pic="http://schemas.openxmlformats.org/drawingml/2006/picture">
+            <wp:extent cx="5029200" cy="3145820"/>
+            <wp:docPr id="18" name="Picture 18"/>
+            <wp:cNvGraphicFramePr>
+              <a:graphicFrameLocks noChangeAspect="1"/>
+            </wp:cNvGraphicFramePr>
+            <a:graphic>
+              <a:graphicData uri="http://schemas.openxmlformats.org/drawingml/2006/picture">
+                <pic:pic>
+                  <pic:nvPicPr>
+                    <pic:cNvPr id="0" name="image_08.png"/>
+                    <pic:cNvPicPr/>
+                  </pic:nvPicPr>
+                  <pic:blipFill>
+                    <a:blip r:embed="rId26"/>
+                    <a:stretch>
+                      <a:fillRect/>
+                    </a:stretch>
+                  </pic:blipFill>
+                  <pic:spPr>
+                    <a:xfrm>
+                      <a:off x="0" y="0"/>
+                      <a:ext cx="5029200" cy="3145820"/>
                     </a:xfrm>
                     <a:prstGeom prst="rect"/>
                   </pic:spPr>

</xml_diff>

<commit_message>
fix(report): add missing sequence diagrams for account and core modules
- Added sequence diagram placeholders for account and core modules
- Updated DIAGRAM_MAP with account_seq and core_seq image paths
- Report.docx now has 20 images (from 18)
- All 5 modules now have: UC overview + Entity + BCE + Sequence diagrams
</commit_message>
<xml_diff>
--- a/output/report.docx
+++ b/output/report.docx
@@ -4763,6 +4763,59 @@
           <w:color w:val="1F4E79"/>
           <w:sz w:val="26"/>
         </w:rPr>
+        <w:t>Biểu đồ tuần tự</w:t>
+      </w:r>
+    </w:p>
+    <w:p>
+      <w:pPr>
+        <w:jc w:val="center"/>
+      </w:pPr>
+      <w:r>
+        <w:drawing>
+          <wp:inline xmlns:a="http://schemas.openxmlformats.org/drawingml/2006/main" xmlns:pic="http://schemas.openxmlformats.org/drawingml/2006/picture">
+            <wp:extent cx="5029200" cy="2583269"/>
+            <wp:docPr id="4" name="Picture 4"/>
+            <wp:cNvGraphicFramePr>
+              <a:graphicFrameLocks noChangeAspect="1"/>
+            </wp:cNvGraphicFramePr>
+            <a:graphic>
+              <a:graphicData uri="http://schemas.openxmlformats.org/drawingml/2006/picture">
+                <pic:pic>
+                  <pic:nvPicPr>
+                    <pic:cNvPr id="0" name="image_09.png"/>
+                    <pic:cNvPicPr/>
+                  </pic:nvPicPr>
+                  <pic:blipFill>
+                    <a:blip r:embed="rId12"/>
+                    <a:stretch>
+                      <a:fillRect/>
+                    </a:stretch>
+                  </pic:blipFill>
+                  <pic:spPr>
+                    <a:xfrm>
+                      <a:off x="0" y="0"/>
+                      <a:ext cx="5029200" cy="2583269"/>
+                    </a:xfrm>
+                    <a:prstGeom prst="rect"/>
+                  </pic:spPr>
+                </pic:pic>
+              </a:graphicData>
+            </a:graphic>
+          </wp:inline>
+        </w:drawing>
+      </w:r>
+    </w:p>
+    <w:p>
+      <w:pPr>
+        <w:pStyle w:val="Heading3"/>
+      </w:pPr>
+      <w:r>
+        <w:rPr>
+          <w:rFonts w:ascii="Times New Roman" w:hAnsi="Times New Roman"/>
+          <w:b/>
+          <w:color w:val="1F4E79"/>
+          <w:sz w:val="26"/>
+        </w:rPr>
         <w:t>Entity chính</w:t>
       </w:r>
     </w:p>
@@ -5419,7 +5472,7 @@
         <w:drawing>
           <wp:inline xmlns:a="http://schemas.openxmlformats.org/drawingml/2006/main" xmlns:pic="http://schemas.openxmlformats.org/drawingml/2006/picture">
             <wp:extent cx="5029200" cy="2950312"/>
-            <wp:docPr id="4" name="Picture 4"/>
+            <wp:docPr id="5" name="Picture 5"/>
             <wp:cNvGraphicFramePr>
               <a:graphicFrameLocks noChangeAspect="1"/>
             </wp:cNvGraphicFramePr>
@@ -5431,7 +5484,7 @@
                     <pic:cNvPicPr/>
                   </pic:nvPicPr>
                   <pic:blipFill>
-                    <a:blip r:embed="rId12"/>
+                    <a:blip r:embed="rId13"/>
                     <a:stretch>
                       <a:fillRect/>
                     </a:stretch>
@@ -5472,7 +5525,7 @@
         <w:drawing>
           <wp:inline xmlns:a="http://schemas.openxmlformats.org/drawingml/2006/main" xmlns:pic="http://schemas.openxmlformats.org/drawingml/2006/picture">
             <wp:extent cx="5029200" cy="4490838"/>
-            <wp:docPr id="5" name="Picture 5"/>
+            <wp:docPr id="6" name="Picture 6"/>
             <wp:cNvGraphicFramePr>
               <a:graphicFrameLocks noChangeAspect="1"/>
             </wp:cNvGraphicFramePr>
@@ -5484,7 +5537,7 @@
                     <pic:cNvPicPr/>
                   </pic:nvPicPr>
                   <pic:blipFill>
-                    <a:blip r:embed="rId13"/>
+                    <a:blip r:embed="rId14"/>
                     <a:stretch>
                       <a:fillRect/>
                     </a:stretch>
@@ -5525,7 +5578,7 @@
         <w:drawing>
           <wp:inline xmlns:a="http://schemas.openxmlformats.org/drawingml/2006/main" xmlns:pic="http://schemas.openxmlformats.org/drawingml/2006/picture">
             <wp:extent cx="5029200" cy="2750173"/>
-            <wp:docPr id="6" name="Picture 6"/>
+            <wp:docPr id="7" name="Picture 7"/>
             <wp:cNvGraphicFramePr>
               <a:graphicFrameLocks noChangeAspect="1"/>
             </wp:cNvGraphicFramePr>
@@ -5537,7 +5590,7 @@
                     <pic:cNvPicPr/>
                   </pic:nvPicPr>
                   <pic:blipFill>
-                    <a:blip r:embed="rId14"/>
+                    <a:blip r:embed="rId15"/>
                     <a:stretch>
                       <a:fillRect/>
                     </a:stretch>
@@ -5578,7 +5631,7 @@
         <w:drawing>
           <wp:inline xmlns:a="http://schemas.openxmlformats.org/drawingml/2006/main" xmlns:pic="http://schemas.openxmlformats.org/drawingml/2006/picture">
             <wp:extent cx="5029200" cy="5799631"/>
-            <wp:docPr id="7" name="Picture 7"/>
+            <wp:docPr id="8" name="Picture 8"/>
             <wp:cNvGraphicFramePr>
               <a:graphicFrameLocks noChangeAspect="1"/>
             </wp:cNvGraphicFramePr>
@@ -5590,7 +5643,7 @@
                     <pic:cNvPicPr/>
                   </pic:nvPicPr>
                   <pic:blipFill>
-                    <a:blip r:embed="rId15"/>
+                    <a:blip r:embed="rId16"/>
                     <a:stretch>
                       <a:fillRect/>
                     </a:stretch>
@@ -6292,7 +6345,7 @@
         <w:drawing>
           <wp:inline xmlns:a="http://schemas.openxmlformats.org/drawingml/2006/main" xmlns:pic="http://schemas.openxmlformats.org/drawingml/2006/picture">
             <wp:extent cx="5029200" cy="3414363"/>
-            <wp:docPr id="8" name="Picture 8"/>
+            <wp:docPr id="9" name="Picture 9"/>
             <wp:cNvGraphicFramePr>
               <a:graphicFrameLocks noChangeAspect="1"/>
             </wp:cNvGraphicFramePr>
@@ -6304,7 +6357,7 @@
                     <pic:cNvPicPr/>
                   </pic:nvPicPr>
                   <pic:blipFill>
-                    <a:blip r:embed="rId16"/>
+                    <a:blip r:embed="rId17"/>
                     <a:stretch>
                       <a:fillRect/>
                     </a:stretch>
@@ -6345,7 +6398,7 @@
         <w:drawing>
           <wp:inline xmlns:a="http://schemas.openxmlformats.org/drawingml/2006/main" xmlns:pic="http://schemas.openxmlformats.org/drawingml/2006/picture">
             <wp:extent cx="5029200" cy="2683437"/>
-            <wp:docPr id="9" name="Picture 9"/>
+            <wp:docPr id="10" name="Picture 10"/>
             <wp:cNvGraphicFramePr>
               <a:graphicFrameLocks noChangeAspect="1"/>
             </wp:cNvGraphicFramePr>
@@ -6357,7 +6410,7 @@
                     <pic:cNvPicPr/>
                   </pic:nvPicPr>
                   <pic:blipFill>
-                    <a:blip r:embed="rId17"/>
+                    <a:blip r:embed="rId18"/>
                     <a:stretch>
                       <a:fillRect/>
                     </a:stretch>
@@ -6398,7 +6451,7 @@
         <w:drawing>
           <wp:inline xmlns:a="http://schemas.openxmlformats.org/drawingml/2006/main" xmlns:pic="http://schemas.openxmlformats.org/drawingml/2006/picture">
             <wp:extent cx="5029200" cy="2123245"/>
-            <wp:docPr id="10" name="Picture 10"/>
+            <wp:docPr id="11" name="Picture 11"/>
             <wp:cNvGraphicFramePr>
               <a:graphicFrameLocks noChangeAspect="1"/>
             </wp:cNvGraphicFramePr>
@@ -6410,7 +6463,7 @@
                     <pic:cNvPicPr/>
                   </pic:nvPicPr>
                   <pic:blipFill>
-                    <a:blip r:embed="rId18"/>
+                    <a:blip r:embed="rId19"/>
                     <a:stretch>
                       <a:fillRect/>
                     </a:stretch>
@@ -6451,7 +6504,7 @@
         <w:drawing>
           <wp:inline xmlns:a="http://schemas.openxmlformats.org/drawingml/2006/main" xmlns:pic="http://schemas.openxmlformats.org/drawingml/2006/picture">
             <wp:extent cx="5029200" cy="2955732"/>
-            <wp:docPr id="11" name="Picture 11"/>
+            <wp:docPr id="12" name="Picture 12"/>
             <wp:cNvGraphicFramePr>
               <a:graphicFrameLocks noChangeAspect="1"/>
             </wp:cNvGraphicFramePr>
@@ -6463,7 +6516,7 @@
                     <pic:cNvPicPr/>
                   </pic:nvPicPr>
                   <pic:blipFill>
-                    <a:blip r:embed="rId19"/>
+                    <a:blip r:embed="rId20"/>
                     <a:stretch>
                       <a:fillRect/>
                     </a:stretch>
@@ -7404,7 +7457,7 @@
         <w:drawing>
           <wp:inline xmlns:a="http://schemas.openxmlformats.org/drawingml/2006/main" xmlns:pic="http://schemas.openxmlformats.org/drawingml/2006/picture">
             <wp:extent cx="5029200" cy="2799761"/>
-            <wp:docPr id="12" name="Picture 12"/>
+            <wp:docPr id="13" name="Picture 13"/>
             <wp:cNvGraphicFramePr>
               <a:graphicFrameLocks noChangeAspect="1"/>
             </wp:cNvGraphicFramePr>
@@ -7416,7 +7469,7 @@
                     <pic:cNvPicPr/>
                   </pic:nvPicPr>
                   <pic:blipFill>
-                    <a:blip r:embed="rId20"/>
+                    <a:blip r:embed="rId21"/>
                     <a:stretch>
                       <a:fillRect/>
                     </a:stretch>
@@ -7457,7 +7510,7 @@
         <w:drawing>
           <wp:inline xmlns:a="http://schemas.openxmlformats.org/drawingml/2006/main" xmlns:pic="http://schemas.openxmlformats.org/drawingml/2006/picture">
             <wp:extent cx="5029200" cy="7782412"/>
-            <wp:docPr id="13" name="Picture 13"/>
+            <wp:docPr id="14" name="Picture 14"/>
             <wp:cNvGraphicFramePr>
               <a:graphicFrameLocks noChangeAspect="1"/>
             </wp:cNvGraphicFramePr>
@@ -7469,7 +7522,7 @@
                     <pic:cNvPicPr/>
                   </pic:nvPicPr>
                   <pic:blipFill>
-                    <a:blip r:embed="rId21"/>
+                    <a:blip r:embed="rId22"/>
                     <a:stretch>
                       <a:fillRect/>
                     </a:stretch>
@@ -7510,7 +7563,7 @@
         <w:drawing>
           <wp:inline xmlns:a="http://schemas.openxmlformats.org/drawingml/2006/main" xmlns:pic="http://schemas.openxmlformats.org/drawingml/2006/picture">
             <wp:extent cx="5029200" cy="2731792"/>
-            <wp:docPr id="14" name="Picture 14"/>
+            <wp:docPr id="15" name="Picture 15"/>
             <wp:cNvGraphicFramePr>
               <a:graphicFrameLocks noChangeAspect="1"/>
             </wp:cNvGraphicFramePr>
@@ -7522,7 +7575,7 @@
                     <pic:cNvPicPr/>
                   </pic:nvPicPr>
                   <pic:blipFill>
-                    <a:blip r:embed="rId22"/>
+                    <a:blip r:embed="rId23"/>
                     <a:stretch>
                       <a:fillRect/>
                     </a:stretch>
@@ -7552,6 +7605,59 @@
           <w:color w:val="1F4E79"/>
           <w:sz w:val="26"/>
         </w:rPr>
+        <w:t>Biểu đồ tuần tự</w:t>
+      </w:r>
+    </w:p>
+    <w:p>
+      <w:pPr>
+        <w:jc w:val="center"/>
+      </w:pPr>
+      <w:r>
+        <w:drawing>
+          <wp:inline xmlns:a="http://schemas.openxmlformats.org/drawingml/2006/main" xmlns:pic="http://schemas.openxmlformats.org/drawingml/2006/picture">
+            <wp:extent cx="5029200" cy="3316528"/>
+            <wp:docPr id="16" name="Picture 16"/>
+            <wp:cNvGraphicFramePr>
+              <a:graphicFrameLocks noChangeAspect="1"/>
+            </wp:cNvGraphicFramePr>
+            <a:graphic>
+              <a:graphicData uri="http://schemas.openxmlformats.org/drawingml/2006/picture">
+                <pic:pic>
+                  <pic:nvPicPr>
+                    <pic:cNvPr id="0" name="image_12.png"/>
+                    <pic:cNvPicPr/>
+                  </pic:nvPicPr>
+                  <pic:blipFill>
+                    <a:blip r:embed="rId24"/>
+                    <a:stretch>
+                      <a:fillRect/>
+                    </a:stretch>
+                  </pic:blipFill>
+                  <pic:spPr>
+                    <a:xfrm>
+                      <a:off x="0" y="0"/>
+                      <a:ext cx="5029200" cy="3316528"/>
+                    </a:xfrm>
+                    <a:prstGeom prst="rect"/>
+                  </pic:spPr>
+                </pic:pic>
+              </a:graphicData>
+            </a:graphic>
+          </wp:inline>
+        </w:drawing>
+      </w:r>
+    </w:p>
+    <w:p>
+      <w:pPr>
+        <w:pStyle w:val="Heading3"/>
+      </w:pPr>
+      <w:r>
+        <w:rPr>
+          <w:rFonts w:ascii="Times New Roman" w:hAnsi="Times New Roman"/>
+          <w:b/>
+          <w:color w:val="1F4E79"/>
+          <w:sz w:val="26"/>
+        </w:rPr>
         <w:t>Entity chính</w:t>
       </w:r>
     </w:p>
@@ -8244,7 +8350,7 @@
         <w:drawing>
           <wp:inline xmlns:a="http://schemas.openxmlformats.org/drawingml/2006/main" xmlns:pic="http://schemas.openxmlformats.org/drawingml/2006/picture">
             <wp:extent cx="5029200" cy="3201180"/>
-            <wp:docPr id="15" name="Picture 15"/>
+            <wp:docPr id="17" name="Picture 17"/>
             <wp:cNvGraphicFramePr>
               <a:graphicFrameLocks noChangeAspect="1"/>
             </wp:cNvGraphicFramePr>
@@ -8256,7 +8362,7 @@
                     <pic:cNvPicPr/>
                   </pic:nvPicPr>
                   <pic:blipFill>
-                    <a:blip r:embed="rId23"/>
+                    <a:blip r:embed="rId25"/>
                     <a:stretch>
                       <a:fillRect/>
                     </a:stretch>
@@ -8297,7 +8403,7 @@
         <w:drawing>
           <wp:inline xmlns:a="http://schemas.openxmlformats.org/drawingml/2006/main" xmlns:pic="http://schemas.openxmlformats.org/drawingml/2006/picture">
             <wp:extent cx="5029200" cy="4649638"/>
-            <wp:docPr id="16" name="Picture 16"/>
+            <wp:docPr id="18" name="Picture 18"/>
             <wp:cNvGraphicFramePr>
               <a:graphicFrameLocks noChangeAspect="1"/>
             </wp:cNvGraphicFramePr>
@@ -8309,7 +8415,7 @@
                     <pic:cNvPicPr/>
                   </pic:nvPicPr>
                   <pic:blipFill>
-                    <a:blip r:embed="rId24"/>
+                    <a:blip r:embed="rId26"/>
                     <a:stretch>
                       <a:fillRect/>
                     </a:stretch>
@@ -8350,7 +8456,7 @@
         <w:drawing>
           <wp:inline xmlns:a="http://schemas.openxmlformats.org/drawingml/2006/main" xmlns:pic="http://schemas.openxmlformats.org/drawingml/2006/picture">
             <wp:extent cx="5029200" cy="1400912"/>
-            <wp:docPr id="17" name="Picture 17"/>
+            <wp:docPr id="19" name="Picture 19"/>
             <wp:cNvGraphicFramePr>
               <a:graphicFrameLocks noChangeAspect="1"/>
             </wp:cNvGraphicFramePr>
@@ -8362,7 +8468,7 @@
                     <pic:cNvPicPr/>
                   </pic:nvPicPr>
                   <pic:blipFill>
-                    <a:blip r:embed="rId25"/>
+                    <a:blip r:embed="rId27"/>
                     <a:stretch>
                       <a:fillRect/>
                     </a:stretch>
@@ -8403,7 +8509,7 @@
         <w:drawing>
           <wp:inline xmlns:a="http://schemas.openxmlformats.org/drawingml/2006/main" xmlns:pic="http://schemas.openxmlformats.org/drawingml/2006/picture">
             <wp:extent cx="5029200" cy="3145820"/>
-            <wp:docPr id="18" name="Picture 18"/>
+            <wp:docPr id="20" name="Picture 20"/>
             <wp:cNvGraphicFramePr>
               <a:graphicFrameLocks noChangeAspect="1"/>
             </wp:cNvGraphicFramePr>
@@ -8415,7 +8521,7 @@
                     <pic:cNvPicPr/>
                   </pic:nvPicPr>
                   <pic:blipFill>
-                    <a:blip r:embed="rId26"/>
+                    <a:blip r:embed="rId28"/>
                     <a:stretch>
                       <a:fillRect/>
                     </a:stretch>

</xml_diff>